<commit_message>
Refactor LoanTemplate class and add project configuration files
</commit_message>
<xml_diff>
--- a/CSC251_Group_Project_20260403.docx
+++ b/CSC251_Group_Project_20260403.docx
@@ -688,7 +688,27 @@
           <w:szCs w:val="24"/>
           <w:highlight w:val="yellow"/>
         </w:rPr>
-        <w:t>Please don’t add JavaFX, awt, swing</w:t>
+        <w:t xml:space="preserve">Please don’t add JavaFX, </w:t>
+      </w:r>
+      <w:proofErr w:type="spellStart"/>
+      <w:r>
+        <w:rPr>
+          <w:rFonts w:ascii="Tahoma" w:hAnsi="Tahoma"/>
+          <w:sz w:val="24"/>
+          <w:szCs w:val="24"/>
+          <w:highlight w:val="yellow"/>
+        </w:rPr>
+        <w:t>awt</w:t>
+      </w:r>
+      <w:proofErr w:type="spellEnd"/>
+      <w:r>
+        <w:rPr>
+          <w:rFonts w:ascii="Tahoma" w:hAnsi="Tahoma"/>
+          <w:sz w:val="24"/>
+          <w:szCs w:val="24"/>
+          <w:highlight w:val="yellow"/>
+        </w:rPr>
+        <w:t>, swing</w:t>
       </w:r>
       <w:r>
         <w:rPr>
@@ -2604,7 +2624,23 @@
                 <w:rFonts w:ascii="Calibri" w:eastAsia="Times New Roman" w:hAnsi="Calibri" w:cs="Calibri"/>
                 <w:color w:val="000000"/>
               </w:rPr>
-              <w:t xml:space="preserve"> $                    (0.00)</w:t>
+              <w:t xml:space="preserve"> $                 </w:t>
+            </w:r>
+            <w:proofErr w:type="gramStart"/>
+            <w:r>
+              <w:rPr>
+                <w:rFonts w:ascii="Calibri" w:eastAsia="Times New Roman" w:hAnsi="Calibri" w:cs="Calibri"/>
+                <w:color w:val="000000"/>
+              </w:rPr>
+              <w:t xml:space="preserve">   (</w:t>
+            </w:r>
+            <w:proofErr w:type="gramEnd"/>
+            <w:r>
+              <w:rPr>
+                <w:rFonts w:ascii="Calibri" w:eastAsia="Times New Roman" w:hAnsi="Calibri" w:cs="Calibri"/>
+                <w:color w:val="000000"/>
+              </w:rPr>
+              <w:t>0.00)</w:t>
             </w:r>
           </w:p>
         </w:tc>
@@ -4207,7 +4243,23 @@
                 <w:rFonts w:ascii="Calibri" w:eastAsia="Times New Roman" w:hAnsi="Calibri" w:cs="Calibri"/>
                 <w:color w:val="000000"/>
               </w:rPr>
-              <w:t xml:space="preserve"> $                    (0.00)</w:t>
+              <w:t xml:space="preserve"> $                 </w:t>
+            </w:r>
+            <w:proofErr w:type="gramStart"/>
+            <w:r>
+              <w:rPr>
+                <w:rFonts w:ascii="Calibri" w:eastAsia="Times New Roman" w:hAnsi="Calibri" w:cs="Calibri"/>
+                <w:color w:val="000000"/>
+              </w:rPr>
+              <w:t xml:space="preserve">   (</w:t>
+            </w:r>
+            <w:proofErr w:type="gramEnd"/>
+            <w:r>
+              <w:rPr>
+                <w:rFonts w:ascii="Calibri" w:eastAsia="Times New Roman" w:hAnsi="Calibri" w:cs="Calibri"/>
+                <w:color w:val="000000"/>
+              </w:rPr>
+              <w:t>0.00)</w:t>
             </w:r>
           </w:p>
         </w:tc>
@@ -6237,6 +6289,7 @@
           <w:lang w:eastAsia="zh-HK"/>
         </w:rPr>
       </w:pPr>
+      <w:proofErr w:type="spellStart"/>
       <w:r>
         <w:rPr>
           <w:rFonts w:ascii="Tahoma" w:eastAsia="Arial Unicode MS" w:hAnsi="Tahoma"/>
@@ -6244,7 +6297,17 @@
           <w:szCs w:val="24"/>
           <w:lang w:eastAsia="zh-HK"/>
         </w:rPr>
-        <w:t>getTotalInterest [</w:t>
+        <w:t>getTotalInterest</w:t>
+      </w:r>
+      <w:proofErr w:type="spellEnd"/>
+      <w:r>
+        <w:rPr>
+          <w:rFonts w:ascii="Tahoma" w:eastAsia="Arial Unicode MS" w:hAnsi="Tahoma"/>
+          <w:sz w:val="24"/>
+          <w:szCs w:val="24"/>
+          <w:lang w:eastAsia="zh-HK"/>
+        </w:rPr>
+        <w:t xml:space="preserve"> [</w:t>
       </w:r>
       <w:r>
         <w:rPr>
@@ -6293,7 +6356,55 @@
           <w:rFonts w:ascii="Tahoma" w:eastAsia="Arial Unicode MS" w:hAnsi="Tahoma"/>
           <w:lang w:eastAsia="zh-HK"/>
         </w:rPr>
-        <w:t xml:space="preserve">(myLoanAmount &gt;= (myMonthlyPayment + extraPay)) </w:t>
+        <w:t>(</w:t>
+      </w:r>
+      <w:proofErr w:type="spellStart"/>
+      <w:r>
+        <w:rPr>
+          <w:rFonts w:ascii="Tahoma" w:eastAsia="Arial Unicode MS" w:hAnsi="Tahoma"/>
+          <w:lang w:eastAsia="zh-HK"/>
+        </w:rPr>
+        <w:t>myLoanAmount</w:t>
+      </w:r>
+      <w:proofErr w:type="spellEnd"/>
+      <w:r>
+        <w:rPr>
+          <w:rFonts w:ascii="Tahoma" w:eastAsia="Arial Unicode MS" w:hAnsi="Tahoma"/>
+          <w:lang w:eastAsia="zh-HK"/>
+        </w:rPr>
+        <w:t xml:space="preserve"> &gt;= (</w:t>
+      </w:r>
+      <w:proofErr w:type="spellStart"/>
+      <w:r>
+        <w:rPr>
+          <w:rFonts w:ascii="Tahoma" w:eastAsia="Arial Unicode MS" w:hAnsi="Tahoma"/>
+          <w:lang w:eastAsia="zh-HK"/>
+        </w:rPr>
+        <w:t>myMonthlyPayment</w:t>
+      </w:r>
+      <w:proofErr w:type="spellEnd"/>
+      <w:r>
+        <w:rPr>
+          <w:rFonts w:ascii="Tahoma" w:eastAsia="Arial Unicode MS" w:hAnsi="Tahoma"/>
+          <w:lang w:eastAsia="zh-HK"/>
+        </w:rPr>
+        <w:t xml:space="preserve"> + </w:t>
+      </w:r>
+      <w:proofErr w:type="spellStart"/>
+      <w:r>
+        <w:rPr>
+          <w:rFonts w:ascii="Tahoma" w:eastAsia="Arial Unicode MS" w:hAnsi="Tahoma"/>
+          <w:lang w:eastAsia="zh-HK"/>
+        </w:rPr>
+        <w:t>extraPay</w:t>
+      </w:r>
+      <w:proofErr w:type="spellEnd"/>
+      <w:r>
+        <w:rPr>
+          <w:rFonts w:ascii="Tahoma" w:eastAsia="Arial Unicode MS" w:hAnsi="Tahoma"/>
+          <w:lang w:eastAsia="zh-HK"/>
+        </w:rPr>
+        <w:t xml:space="preserve">)) </w:t>
       </w:r>
       <w:r>
         <w:rPr>
@@ -6354,7 +6465,39 @@
           <w:rFonts w:ascii="Tahoma" w:eastAsia="Arial Unicode MS" w:hAnsi="Tahoma"/>
           <w:lang w:eastAsia="zh-HK"/>
         </w:rPr>
-        <w:t>(myLoanAmount &gt;= myMonthlyPayment)</w:t>
+        <w:t>(</w:t>
+      </w:r>
+      <w:proofErr w:type="spellStart"/>
+      <w:r>
+        <w:rPr>
+          <w:rFonts w:ascii="Tahoma" w:eastAsia="Arial Unicode MS" w:hAnsi="Tahoma"/>
+          <w:lang w:eastAsia="zh-HK"/>
+        </w:rPr>
+        <w:t>myLoanAmount</w:t>
+      </w:r>
+      <w:proofErr w:type="spellEnd"/>
+      <w:r>
+        <w:rPr>
+          <w:rFonts w:ascii="Tahoma" w:eastAsia="Arial Unicode MS" w:hAnsi="Tahoma"/>
+          <w:lang w:eastAsia="zh-HK"/>
+        </w:rPr>
+        <w:t xml:space="preserve"> &gt;= </w:t>
+      </w:r>
+      <w:proofErr w:type="spellStart"/>
+      <w:r>
+        <w:rPr>
+          <w:rFonts w:ascii="Tahoma" w:eastAsia="Arial Unicode MS" w:hAnsi="Tahoma"/>
+          <w:lang w:eastAsia="zh-HK"/>
+        </w:rPr>
+        <w:t>myMonthlyPayment</w:t>
+      </w:r>
+      <w:proofErr w:type="spellEnd"/>
+      <w:r>
+        <w:rPr>
+          <w:rFonts w:ascii="Tahoma" w:eastAsia="Arial Unicode MS" w:hAnsi="Tahoma"/>
+          <w:lang w:eastAsia="zh-HK"/>
+        </w:rPr>
+        <w:t>)</w:t>
       </w:r>
       <w:r>
         <w:rPr>
@@ -6406,7 +6549,39 @@
           <w:rFonts w:ascii="Tahoma" w:eastAsia="Arial Unicode MS" w:hAnsi="Tahoma"/>
           <w:lang w:eastAsia="zh-HK"/>
         </w:rPr>
-        <w:t>if (myLoanAmount &lt; myMonthlyPayment) [</w:t>
+        <w:t>if (</w:t>
+      </w:r>
+      <w:proofErr w:type="spellStart"/>
+      <w:r>
+        <w:rPr>
+          <w:rFonts w:ascii="Tahoma" w:eastAsia="Arial Unicode MS" w:hAnsi="Tahoma"/>
+          <w:lang w:eastAsia="zh-HK"/>
+        </w:rPr>
+        <w:t>myLoanAmount</w:t>
+      </w:r>
+      <w:proofErr w:type="spellEnd"/>
+      <w:r>
+        <w:rPr>
+          <w:rFonts w:ascii="Tahoma" w:eastAsia="Arial Unicode MS" w:hAnsi="Tahoma"/>
+          <w:lang w:eastAsia="zh-HK"/>
+        </w:rPr>
+        <w:t xml:space="preserve"> &lt; </w:t>
+      </w:r>
+      <w:proofErr w:type="spellStart"/>
+      <w:r>
+        <w:rPr>
+          <w:rFonts w:ascii="Tahoma" w:eastAsia="Arial Unicode MS" w:hAnsi="Tahoma"/>
+          <w:lang w:eastAsia="zh-HK"/>
+        </w:rPr>
+        <w:t>myMonthlyPayment</w:t>
+      </w:r>
+      <w:proofErr w:type="spellEnd"/>
+      <w:r>
+        <w:rPr>
+          <w:rFonts w:ascii="Tahoma" w:eastAsia="Arial Unicode MS" w:hAnsi="Tahoma"/>
+          <w:lang w:eastAsia="zh-HK"/>
+        </w:rPr>
+        <w:t>) [</w:t>
       </w:r>
       <w:r>
         <w:rPr>

</xml_diff>